<commit_message>
updated the remaining sections
</commit_message>
<xml_diff>
--- a/report.docx
+++ b/report.docx
@@ -24,12 +24,14 @@
         <w:spacing w:after="120"/>
         <w:jc w:val="center"/>
       </w:pPr>
+      <w:proofErr w:type="gramStart"/>
       <w:r>
         <w:rPr>
           <w:sz w:val="28"/>
         </w:rPr>
         <w:t>Masters in Data Science</w:t>
       </w:r>
+      <w:proofErr w:type="gramEnd"/>
     </w:p>
     <w:p>
       <w:pPr>
@@ -117,6 +119,12 @@
     <w:sdt>
       <w:sdtPr>
         <w:rPr>
+          <w:rFonts w:asciiTheme="minorHAnsi" w:eastAsiaTheme="minorEastAsia" w:hAnsiTheme="minorHAnsi" w:cstheme="minorBidi"/>
+          <w:b w:val="0"/>
+          <w:bCs w:val="0"/>
+          <w:color w:val="auto"/>
+          <w:sz w:val="22"/>
+          <w:szCs w:val="22"/>
           <w:lang w:val="en-GB"/>
         </w:rPr>
         <w:id w:val="-1612885786"/>
@@ -125,14 +133,6 @@
           <w:docPartUnique/>
         </w:docPartObj>
       </w:sdtPr>
-      <w:sdtEndPr>
-        <w:rPr>
-          <w:rFonts w:asciiTheme="minorHAnsi" w:eastAsiaTheme="minorEastAsia" w:hAnsiTheme="minorHAnsi" w:cstheme="minorBidi"/>
-          <w:color w:val="auto"/>
-          <w:sz w:val="22"/>
-          <w:szCs w:val="22"/>
-        </w:rPr>
-      </w:sdtEndPr>
       <w:sdtContent>
         <w:p>
           <w:pPr>
@@ -442,21 +442,7 @@
                 <w:rStyle w:val="Hyperlink"/>
                 <w:noProof/>
               </w:rPr>
-              <w:t>3.1 Mathemati</w:t>
-            </w:r>
-            <w:r>
-              <w:rPr>
-                <w:rStyle w:val="Hyperlink"/>
-                <w:noProof/>
-              </w:rPr>
-              <w:t>c</w:t>
-            </w:r>
-            <w:r>
-              <w:rPr>
-                <w:rStyle w:val="Hyperlink"/>
-                <w:noProof/>
-              </w:rPr>
-              <w:t>al Analysis</w:t>
+              <w:t>3.1 Mathematical Analysis</w:t>
             </w:r>
             <w:r>
               <w:rPr>
@@ -1364,7 +1350,13 @@
     </w:p>
     <w:p>
       <w:r>
-        <w:t>The study’s background and purpose are set out in this section. Mathematics offers a strong toolbox to help understand and control urban resource systems. The assignment is a continuation of the Urban Resource Intelligence (URI) consultancy scenario and uses four main mathematical discipline (linear algebra, calculus, probability, and statistics) to analyze the demand and consumption of resources for houses located within an urban area.</w:t>
+        <w:t xml:space="preserve">The study’s background and purpose are set out in this section. Mathematics offers a strong toolbox to help understand and control urban resource systems. The assignment is a continuation of the Urban Resource Intelligence (URI) consultancy scenario and uses four main mathematical </w:t>
+      </w:r>
+      <w:r>
+        <w:t>disciplines</w:t>
+      </w:r>
+      <w:r>
+        <w:t xml:space="preserve"> (linear algebra, calculus, probability, and statistics) to analyze the demand and consumption of resources for houses located within an urban area.</w:t>
       </w:r>
     </w:p>
     <w:p>
@@ -1381,7 +1373,13 @@
         </w:numPr>
       </w:pPr>
       <w:r>
-        <w:t>Solving a system of linear equations too obtain the steady state resource demand in four urban zones;</w:t>
+        <w:t xml:space="preserve">Solving a system of linear equations </w:t>
+      </w:r>
+      <w:r>
+        <w:t>to</w:t>
+      </w:r>
+      <w:r>
+        <w:t xml:space="preserve"> obtain the steady state resource demand in four urban zones;</w:t>
       </w:r>
     </w:p>
     <w:p>
@@ -1441,9 +1439,12 @@
       </w:pPr>
       <w:bookmarkStart w:id="3" w:name="_Toc234248663"/>
       <w:r>
-        <w:t>3. Task 1: Steady-State Resource Demand (Linear Algebra)</w:t>
+        <w:t xml:space="preserve">3. Task 1: </w:t>
       </w:r>
       <w:bookmarkEnd w:id="3"/>
+      <w:r>
+        <w:t>Steady-State Resource Demand (Linear Algebra), 3.</w:t>
+      </w:r>
     </w:p>
     <w:p>
       <w:pPr>
@@ -1451,16 +1452,52 @@
       </w:pPr>
       <w:bookmarkStart w:id="4" w:name="_Toc234248664"/>
       <w:r>
-        <w:t>3.1 Mathematical Analysis</w:t>
+        <w:t xml:space="preserve">3.1 </w:t>
       </w:r>
       <w:bookmarkEnd w:id="4"/>
+      <w:r>
+        <w:t>Mathematical Analysis</w:t>
+      </w:r>
     </w:p>
     <w:p>
       <w:pPr>
         <w:spacing w:after="120"/>
       </w:pPr>
       <w:r>
-        <w:t>The problem is to determine the equilibrium daily resource demand across four interconnected urban zones. The relationships between zones are described by a system of four linear equations in four unknowns (x1, x2, x3, x4), where each xi represents the net daily demand (in units) for zone i.</w:t>
+        <w:t xml:space="preserve">The goal is to identify the daily resource demand equilibrium in the four interrelated urban areas. The relationship </w:t>
+      </w:r>
+      <w:proofErr w:type="gramStart"/>
+      <w:r>
+        <w:t>between  zones</w:t>
+      </w:r>
+      <w:proofErr w:type="gramEnd"/>
+      <w:r>
+        <w:t xml:space="preserve"> </w:t>
+      </w:r>
+      <w:proofErr w:type="gramStart"/>
+      <w:r>
+        <w:t>are</w:t>
+      </w:r>
+      <w:proofErr w:type="gramEnd"/>
+      <w:r>
+        <w:t xml:space="preserve"> given by set of four linear equations in four </w:t>
+      </w:r>
+      <w:proofErr w:type="gramStart"/>
+      <w:r>
+        <w:t>unknown</w:t>
+      </w:r>
+      <w:proofErr w:type="gramEnd"/>
+      <w:r>
+        <w:t>: x1, x2, x3 x4, x1 being the net daily demand (units) for zone 1, x2 being the net daily demand</w:t>
+      </w:r>
+      <w:r>
+        <w:t xml:space="preserve"> (units)</w:t>
+      </w:r>
+      <w:r>
+        <w:t xml:space="preserve"> for zone </w:t>
+      </w:r>
+      <w:r>
+        <w:t>2, and so on.</w:t>
       </w:r>
     </w:p>
     <w:p>
@@ -1471,7 +1508,21 @@
         <w:rPr>
           <w:b/>
         </w:rPr>
-        <w:t>The system is written in matrix form as Ax = b:</w:t>
+        <w:t xml:space="preserve">The system can be expressed in matrix from </w:t>
+      </w:r>
+      <w:proofErr w:type="spellStart"/>
+      <w:r>
+        <w:rPr>
+          <w:b/>
+        </w:rPr>
+        <w:t>from</w:t>
+      </w:r>
+      <w:proofErr w:type="spellEnd"/>
+      <w:r>
+        <w:rPr>
+          <w:b/>
+        </w:rPr>
+        <w:t xml:space="preserve"> Ax=b:</w:t>
       </w:r>
     </w:p>
     <w:p>
@@ -1587,6 +1638,7 @@
               <w:rFonts w:ascii="Cambria Math" w:hAnsi="Cambria Math"/>
               <w:sz w:val="24"/>
             </w:rPr>
+            <w:lastRenderedPageBreak/>
             <m:t xml:space="preserve">A = </m:t>
           </m:r>
           <m:d>
@@ -1629,21 +1681,7 @@
                   <w:rFonts w:ascii="Cambria Math" w:hAnsi="Cambria Math"/>
                   <w:sz w:val="24"/>
                 </w:rPr>
-                <m:t>,</m:t>
-              </m:r>
-              <m:r>
-                <w:rPr>
-                  <w:rFonts w:ascii="Cambria Math" w:hAnsi="Cambria Math"/>
-                  <w:sz w:val="24"/>
-                </w:rPr>
-                <m:t xml:space="preserve"> </m:t>
-              </m:r>
-              <m:r>
-                <w:rPr>
-                  <w:rFonts w:ascii="Cambria Math" w:hAnsi="Cambria Math"/>
-                  <w:sz w:val="24"/>
-                </w:rPr>
-                <m:t xml:space="preserve"> </m:t>
+                <m:t xml:space="preserve">,  </m:t>
               </m:r>
               <m:d>
                 <m:dPr>
@@ -1672,21 +1710,7 @@
                   <w:rFonts w:ascii="Cambria Math" w:hAnsi="Cambria Math"/>
                   <w:sz w:val="24"/>
                 </w:rPr>
-                <m:t>,</m:t>
-              </m:r>
-              <m:r>
-                <w:rPr>
-                  <w:rFonts w:ascii="Cambria Math" w:hAnsi="Cambria Math"/>
-                  <w:sz w:val="24"/>
-                </w:rPr>
-                <m:t xml:space="preserve"> </m:t>
-              </m:r>
-              <m:r>
-                <w:rPr>
-                  <w:rFonts w:ascii="Cambria Math" w:hAnsi="Cambria Math"/>
-                  <w:sz w:val="24"/>
-                </w:rPr>
-                <m:t xml:space="preserve"> </m:t>
+                <m:t xml:space="preserve">,  </m:t>
               </m:r>
               <m:d>
                 <m:dPr>
@@ -1715,21 +1739,7 @@
                   <w:rFonts w:ascii="Cambria Math" w:hAnsi="Cambria Math"/>
                   <w:sz w:val="24"/>
                 </w:rPr>
-                <m:t>,</m:t>
-              </m:r>
-              <m:r>
-                <w:rPr>
-                  <w:rFonts w:ascii="Cambria Math" w:hAnsi="Cambria Math"/>
-                  <w:sz w:val="24"/>
-                </w:rPr>
-                <m:t xml:space="preserve"> </m:t>
-              </m:r>
-              <m:r>
-                <w:rPr>
-                  <w:rFonts w:ascii="Cambria Math" w:hAnsi="Cambria Math"/>
-                  <w:sz w:val="24"/>
-                </w:rPr>
-                <m:t xml:space="preserve"> </m:t>
+                <m:t xml:space="preserve">,  </m:t>
               </m:r>
               <m:d>
                 <m:dPr>
@@ -1774,7 +1784,6 @@
               <w:rFonts w:ascii="Cambria Math" w:hAnsi="Cambria Math"/>
               <w:sz w:val="24"/>
             </w:rPr>
-            <w:lastRenderedPageBreak/>
             <m:t xml:space="preserve">b = </m:t>
           </m:r>
           <m:sSup>
@@ -1829,7 +1838,15 @@
         <w:spacing w:after="120"/>
       </w:pPr>
       <w:r>
-        <w:t>To determine whether a unique solution exists, we check three properties: the determinant (must be non-zero for invertibility), the rank (must equal the number of equations for full linear independence), and the condition number (to assess numerical stability).</w:t>
+        <w:t xml:space="preserve">We check three other properties: the determinant should be non-zero if there is unique solution, the rank should be equal to number of equations </w:t>
+      </w:r>
+      <w:proofErr w:type="gramStart"/>
+      <w:r>
+        <w:t>in order to</w:t>
+      </w:r>
+      <w:proofErr w:type="gramEnd"/>
+      <w:r>
+        <w:t xml:space="preserve"> have full linear independence, and the condition number to check numerical stability.</w:t>
       </w:r>
     </w:p>
     <w:p>
@@ -1850,7 +1867,7 @@
         <w:rPr>
           <w:b/>
         </w:rPr>
-        <w:t>Step 1: Gaussian elimination (by-hand style working)</w:t>
+        <w:t xml:space="preserve">Step 1: Gaussian elimination (working by hand) </w:t>
       </w:r>
     </w:p>
     <w:p>
@@ -1858,7 +1875,15 @@
         <w:spacing w:after="120"/>
       </w:pPr>
       <w:r>
-        <w:t>We form the augmented matrix [A|b] and perform row operations to reach row-echelon form:</w:t>
+        <w:t>We construct the augmented matrix [</w:t>
+      </w:r>
+      <w:proofErr w:type="spellStart"/>
+      <w:r>
+        <w:t>A|b</w:t>
+      </w:r>
+      <w:proofErr w:type="spellEnd"/>
+      <w:r>
+        <w:t>] and use row operations to obtain row-echelon form:</w:t>
       </w:r>
     </w:p>
     <w:p>
@@ -1908,21 +1933,7 @@
               <w:rFonts w:ascii="Cambria Math" w:hAnsi="Cambria Math"/>
               <w:sz w:val="24"/>
             </w:rPr>
-            <m:t xml:space="preserve">= [[2, -1, 1, 0, |, 120], </m:t>
-          </m:r>
-          <m:r>
-            <w:rPr>
-              <w:rFonts w:ascii="Cambria Math" w:hAnsi="Cambria Math"/>
-              <w:sz w:val="24"/>
-            </w:rPr>
-            <m:t xml:space="preserve"> </m:t>
-          </m:r>
-          <m:r>
-            <w:rPr>
-              <w:rFonts w:ascii="Cambria Math" w:hAnsi="Cambria Math"/>
-              <w:sz w:val="24"/>
-            </w:rPr>
-            <m:t>[-1, 3, 0, -1, |, 150], [1, 1, 2, -1, |, 180], [0, -1, 1, 2, |, 140]]</m:t>
+            <m:t>= [[2, -1, 1, 0, |, 120],  [-1, 3, 0, -1, |, 150], [1, 1, 2, -1, |, 180], [0, -1, 1, 2, |, 140]]</m:t>
           </m:r>
         </m:oMath>
       </m:oMathPara>
@@ -1985,13 +1996,7 @@
             <w:rPr>
               <w:rFonts w:ascii="Cambria Math" w:hAnsi="Cambria Math"/>
             </w:rPr>
-            <m:t xml:space="preserve">  </m:t>
-          </m:r>
-          <m:r>
-            <w:rPr>
-              <w:rFonts w:ascii="Cambria Math" w:hAnsi="Cambria Math"/>
-            </w:rPr>
-            <m:t xml:space="preserve">R1; R3 -&gt; R3 - </m:t>
+            <m:t xml:space="preserve">  R1; R3 -&gt; R3 - </m:t>
           </m:r>
           <m:d>
             <m:dPr>
@@ -2045,7 +2050,7 @@
         <w:spacing w:after="120"/>
       </w:pPr>
       <w:r>
-        <w:t>After elimination and back-substitution, the solution is:</w:t>
+        <w:t>Once elimination and back substitution, the solution is:</w:t>
       </w:r>
     </w:p>
     <w:p>
@@ -2184,7 +2189,7 @@
         <w:spacing w:after="120"/>
       </w:pPr>
       <w:r>
-        <w:t>The system was solved using numpy.linalg.solve. The results are shown below:</w:t>
+        <w:t>We used numpy.linalg.solve to solve the system. The answer are given below:</w:t>
       </w:r>
     </w:p>
     <w:p>
@@ -2202,30 +2207,43 @@
     <w:p>
       <w:pPr>
         <w:spacing w:after="120"/>
+        <w:rPr>
+          <w:b/>
+        </w:rPr>
       </w:pPr>
       <w:r>
         <w:rPr>
           <w:b/>
         </w:rPr>
-        <w:t>Key numerical results from Python:</w:t>
+        <w:t>Some results are presented numerically:</w:t>
       </w:r>
     </w:p>
     <w:p>
       <w:pPr>
-        <w:pStyle w:val="ListBullet"/>
-        <w:spacing w:after="40"/>
+        <w:spacing w:after="120"/>
       </w:pPr>
       <w:r>
-        <w:t>det(A) = 12.00 (non-zero, confirming a unique solution)</w:t>
+        <w:t>Det(A) = {12.00} (not zero means there is exactly one solution)</w:t>
       </w:r>
     </w:p>
     <w:p>
       <w:pPr>
         <w:pStyle w:val="ListBullet"/>
+        <w:numPr>
+          <w:ilvl w:val="0"/>
+          <w:numId w:val="0"/>
+        </w:numPr>
         <w:spacing w:after="40"/>
+        <w:ind w:left="360" w:hanging="360"/>
       </w:pPr>
       <w:r>
-        <w:t>rank(A) = 4 (full rank, all equations are independent)</w:t>
+        <w:t xml:space="preserve">The matrix a is full rank, all of </w:t>
+      </w:r>
+      <w:r>
+        <w:t>its</w:t>
+      </w:r>
+      <w:r>
+        <w:t xml:space="preserve"> equations are independent, rank(A) = 4</w:t>
       </w:r>
     </w:p>
     <w:p>
@@ -2234,7 +2252,7 @@
         <w:spacing w:after="40"/>
       </w:pPr>
       <w:r>
-        <w:t>Condition number kappa(A) = 7.92 (well-conditioned, numerically stable)</w:t>
+        <w:t>Condition number kappa(A) = 7.92 well-conditioned, numerically stable</w:t>
       </w:r>
     </w:p>
     <w:p>
@@ -2243,7 +2261,7 @@
         <w:spacing w:after="40"/>
       </w:pPr>
       <w:r>
-        <w:t>Maximum residual error: 2.84e-14 (essentially zero - solution verified)</w:t>
+        <w:t>Maximum error = 2.84e-14 (negligible – solution is correct)</w:t>
       </w:r>
     </w:p>
     <w:p>
@@ -2261,7 +2279,13 @@
         <w:spacing w:after="120"/>
       </w:pPr>
       <w:r>
-        <w:t>The solution reveals distinct demand profiles across the four zones. Zone 2 carries the highest equilibrium demand at 123.33 units/day, while Zone 3 has the lowest at 33.33 units/day. Zone 1 (105.00) and Zone 4 (115.00) fall in between. The non-zero determinant and full rank confirm that this is a unique, stable equilibrium - meaning the system converges to exactly one set of demands regardless of starting conditions.</w:t>
+        <w:t>The solution shows the unique demand patterns in each of the four zones. The equilibrium demand of the zone 2 is highest at 123.33 units/day and the lowest equilibrium demand of the zone 3 is33.33 unit/day.</w:t>
+      </w:r>
+      <w:r>
+        <w:t xml:space="preserve"> Zone 1 (105.00) and Zone 4 (115.00) fall in between.</w:t>
+      </w:r>
+      <w:r>
+        <w:t xml:space="preserve"> A non-zero determinant and full rank assures that this is a unique, stable equilibrium, that is to say, the system settles to a single set of demands, no matter what starting position it is assumed.</w:t>
       </w:r>
     </w:p>
     <w:p>
@@ -2269,7 +2293,7 @@
         <w:spacing w:after="120"/>
       </w:pPr>
       <w:r>
-        <w:t>For urban planners, this has an important implication: the resource distribution network has a single predictable steady state. Resources can be allocated proportionally with confidence. Zone 2 requires the most capacity (roughly 3.7 times Zone 3), suggesting it may be a high-density residential or commercial area. Zone 3's low demand might indicate a green zone or low-density area.</w:t>
+        <w:t>The important urban planning implication for the planners is that the distribution of resources has a single prediction steady state. Resources can be provided in a proportional manner with certainty. Zone 2 is the densest (approximately 3.7 times zone 3) and is unlikely to be high-density residential or commercial area. Low demand in the zone 3 could represent a green zone or a low density zone.</w:t>
       </w:r>
     </w:p>
     <w:p>
@@ -2279,9 +2303,12 @@
       <w:bookmarkStart w:id="7" w:name="_Toc234248667"/>
       <w:r>
         <w:lastRenderedPageBreak/>
-        <w:t>3.4 Visualisation</w:t>
+        <w:t xml:space="preserve">3.4 </w:t>
       </w:r>
       <w:bookmarkEnd w:id="7"/>
+      <w:r>
+        <w:t>Visualization</w:t>
+      </w:r>
     </w:p>
     <w:p>
       <w:pPr>
@@ -2332,24 +2359,27 @@
       <w:pPr>
         <w:spacing w:after="120"/>
         <w:jc w:val="center"/>
+        <w:rPr>
+          <w:i/>
+          <w:iCs/>
+          <w:sz w:val="16"/>
+          <w:szCs w:val="16"/>
+        </w:rPr>
       </w:pPr>
       <w:r>
         <w:rPr>
           <w:i/>
-          <w:sz w:val="18"/>
+          <w:iCs/>
+          <w:sz w:val="16"/>
+          <w:szCs w:val="16"/>
         </w:rPr>
-        <w:t>Figure 1: Steady-state daily demand by urban zone. The dashed line shows the average demand across all four zones.</w:t>
+        <w:t>Figure 1: Daily demand for each urban area at steady state. The dashed line represents an average of the demands from all four zones.</w:t>
       </w:r>
     </w:p>
     <w:p>
-      <w:pPr>
-        <w:spacing w:after="120"/>
-      </w:pPr>
       <w:r>
-        <w:t>Figure 1 shows the equilibrium demand for each zone as a bar chart. The visual comparison makes it immediately clear that Zone 2 is the highest-demand area and Zone 3 the lowest. The average demand line helps planners see which zones are above or below the mean.</w:t>
+        <w:t>The equilibrium demand of each zone is represented as a bar graph in figure 1. By looking at the visual comparison, it can be seen that Zone 2 is the most in demand while Zone 3 is the least in demand. Average demand line aids planners to visualize if zones are above or below average.</w:t>
       </w:r>
-    </w:p>
-    <w:p>
       <w:r>
         <w:br w:type="page"/>
       </w:r>
@@ -2361,9 +2391,12 @@
       <w:bookmarkStart w:id="8" w:name="_Toc234248668"/>
       <w:r>
         <w:lastRenderedPageBreak/>
-        <w:t>4. Task 2: Demand Over Time (Calculus)</w:t>
+        <w:t xml:space="preserve">4. </w:t>
       </w:r>
       <w:bookmarkEnd w:id="8"/>
+      <w:r>
+        <w:t>Task 2: Demand Over Time (Calculus)</w:t>
+      </w:r>
     </w:p>
     <w:p>
       <w:pPr>
@@ -2380,112 +2413,7 @@
         <w:spacing w:after="120"/>
       </w:pPr>
       <w:r>
-        <w:t xml:space="preserve">The demand function </w:t>
-      </w:r>
-      <m:oMath>
-        <m:r>
-          <w:rPr>
-            <w:rFonts w:ascii="Cambria Math" w:hAnsi="Cambria Math"/>
-          </w:rPr>
-          <m:t>D</m:t>
-        </m:r>
-        <m:d>
-          <m:dPr>
-            <m:ctrlPr>
-              <w:rPr>
-                <w:rFonts w:ascii="Cambria Math" w:hAnsi="Cambria Math"/>
-                <w:i/>
-              </w:rPr>
-            </m:ctrlPr>
-          </m:dPr>
-          <m:e>
-            <m:r>
-              <w:rPr>
-                <w:rFonts w:ascii="Cambria Math" w:hAnsi="Cambria Math"/>
-              </w:rPr>
-              <m:t>t</m:t>
-            </m:r>
-          </m:e>
-        </m:d>
-        <m:r>
-          <w:rPr>
-            <w:rFonts w:ascii="Cambria Math" w:hAnsi="Cambria Math"/>
-          </w:rPr>
-          <m:t>= 4</m:t>
-        </m:r>
-        <m:sSup>
-          <m:sSupPr>
-            <m:ctrlPr>
-              <w:rPr>
-                <w:rFonts w:ascii="Cambria Math" w:hAnsi="Cambria Math"/>
-                <w:i/>
-              </w:rPr>
-            </m:ctrlPr>
-          </m:sSupPr>
-          <m:e>
-            <m:r>
-              <w:rPr>
-                <w:rFonts w:ascii="Cambria Math" w:hAnsi="Cambria Math"/>
-              </w:rPr>
-              <m:t>t</m:t>
-            </m:r>
-          </m:e>
-          <m:sup>
-            <m:r>
-              <w:rPr>
-                <w:rFonts w:ascii="Cambria Math" w:hAnsi="Cambria Math"/>
-              </w:rPr>
-              <m:t>3</m:t>
-            </m:r>
-          </m:sup>
-        </m:sSup>
-        <m:r>
-          <w:rPr>
-            <w:rFonts w:ascii="Cambria Math" w:hAnsi="Cambria Math"/>
-          </w:rPr>
-          <m:t>- 18</m:t>
-        </m:r>
-        <m:sSup>
-          <m:sSupPr>
-            <m:ctrlPr>
-              <w:rPr>
-                <w:rFonts w:ascii="Cambria Math" w:hAnsi="Cambria Math"/>
-                <w:i/>
-              </w:rPr>
-            </m:ctrlPr>
-          </m:sSupPr>
-          <m:e>
-            <m:r>
-              <w:rPr>
-                <w:rFonts w:ascii="Cambria Math" w:hAnsi="Cambria Math"/>
-              </w:rPr>
-              <m:t>t</m:t>
-            </m:r>
-          </m:e>
-          <m:sup>
-            <m:r>
-              <w:rPr>
-                <w:rFonts w:ascii="Cambria Math" w:hAnsi="Cambria Math"/>
-              </w:rPr>
-              <m:t>2</m:t>
-            </m:r>
-          </m:sup>
-        </m:sSup>
-        <m:r>
-          <w:rPr>
-            <w:rFonts w:ascii="Cambria Math" w:hAnsi="Cambria Math"/>
-          </w:rPr>
-          <m:t>+ 24t</m:t>
-        </m:r>
-        <m:r>
-          <w:rPr>
-            <w:rFonts w:ascii="Cambria Math" w:hAnsi="Cambria Math"/>
-          </w:rPr>
-          <m:t xml:space="preserve"> + 90</m:t>
-        </m:r>
-      </m:oMath>
-      <w:r>
-        <w:t xml:space="preserve"> models resource demand over a 4-hour period, where t is measured in hours. The goal is to identify when demand peaks and troughs, how fast it changes, and what this means for operational planning.</w:t>
+        <w:t>Resource demand is modeled by a demand function D(t)= 4t^3 – 18t^2 + 24t + 90 for 4 hours. The aim is to help locate high and low demand times, the rate of change and the implications for operational planning.</w:t>
       </w:r>
     </w:p>
     <w:p>
@@ -2496,7 +2424,7 @@
         <w:rPr>
           <w:b/>
         </w:rPr>
-        <w:t>We use differential calculus:</w:t>
+        <w:t>We have learned to use differential calculus:</w:t>
       </w:r>
     </w:p>
     <w:p>
@@ -2512,13 +2440,7 @@
           <w:rPr>
             <w:rFonts w:ascii="Cambria Math" w:hAnsi="Cambria Math"/>
           </w:rPr>
-          <m:t xml:space="preserve">D'(t) = </m:t>
-        </m:r>
-        <m:r>
-          <w:rPr>
-            <w:rFonts w:ascii="Cambria Math" w:hAnsi="Cambria Math"/>
-          </w:rPr>
-          <m:t>12</m:t>
+          <m:t>D'(t) = 12</m:t>
         </m:r>
         <m:sSup>
           <m:sSupPr>
@@ -2563,72 +2485,8 @@
         <w:spacing w:after="40"/>
       </w:pPr>
       <w:r>
-        <w:t xml:space="preserve">Second derivative </w:t>
+        <w:t xml:space="preserve">Second derivative D^’’(t) = 24t – 36 </w:t>
       </w:r>
-      <m:oMath>
-        <m:sSup>
-          <m:sSupPr>
-            <m:ctrlPr>
-              <w:rPr>
-                <w:rFonts w:ascii="Cambria Math" w:hAnsi="Cambria Math"/>
-                <w:i/>
-              </w:rPr>
-            </m:ctrlPr>
-          </m:sSupPr>
-          <m:e>
-            <m:r>
-              <w:rPr>
-                <w:rFonts w:ascii="Cambria Math" w:hAnsi="Cambria Math"/>
-              </w:rPr>
-              <m:t>D</m:t>
-            </m:r>
-          </m:e>
-          <m:sup>
-            <m:r>
-              <w:rPr>
-                <w:rFonts w:ascii="Cambria Math" w:hAnsi="Cambria Math"/>
-              </w:rPr>
-              <m:t>'</m:t>
-            </m:r>
-            <m:r>
-              <w:rPr>
-                <w:rFonts w:ascii="Cambria Math" w:hAnsi="Cambria Math"/>
-              </w:rPr>
-              <m:t>'</m:t>
-            </m:r>
-          </m:sup>
-        </m:sSup>
-        <m:d>
-          <m:dPr>
-            <m:ctrlPr>
-              <w:rPr>
-                <w:rFonts w:ascii="Cambria Math" w:hAnsi="Cambria Math"/>
-                <w:i/>
-              </w:rPr>
-            </m:ctrlPr>
-          </m:dPr>
-          <m:e>
-            <m:r>
-              <w:rPr>
-                <w:rFonts w:ascii="Cambria Math" w:hAnsi="Cambria Math"/>
-              </w:rPr>
-              <m:t>t</m:t>
-            </m:r>
-          </m:e>
-        </m:d>
-        <m:r>
-          <w:rPr>
-            <w:rFonts w:ascii="Cambria Math" w:hAnsi="Cambria Math"/>
-          </w:rPr>
-          <m:t>= 24t</m:t>
-        </m:r>
-        <m:r>
-          <w:rPr>
-            <w:rFonts w:ascii="Cambria Math" w:hAnsi="Cambria Math"/>
-          </w:rPr>
-          <m:t xml:space="preserve"> - 36 </m:t>
-        </m:r>
-      </m:oMath>
       <w:r>
         <w:t>- tells us about concavity (acceleration of change)</w:t>
       </w:r>
@@ -2639,62 +2497,7 @@
         <w:spacing w:after="40"/>
       </w:pPr>
       <w:r>
-        <w:t xml:space="preserve">Critical points occur where </w:t>
-      </w:r>
-      <m:oMath>
-        <m:sSup>
-          <m:sSupPr>
-            <m:ctrlPr>
-              <w:rPr>
-                <w:rFonts w:ascii="Cambria Math" w:hAnsi="Cambria Math"/>
-                <w:i/>
-              </w:rPr>
-            </m:ctrlPr>
-          </m:sSupPr>
-          <m:e>
-            <m:r>
-              <w:rPr>
-                <w:rFonts w:ascii="Cambria Math" w:hAnsi="Cambria Math"/>
-              </w:rPr>
-              <m:t>D</m:t>
-            </m:r>
-          </m:e>
-          <m:sup>
-            <m:r>
-              <w:rPr>
-                <w:rFonts w:ascii="Cambria Math" w:hAnsi="Cambria Math"/>
-              </w:rPr>
-              <m:t>'</m:t>
-            </m:r>
-          </m:sup>
-        </m:sSup>
-        <m:d>
-          <m:dPr>
-            <m:ctrlPr>
-              <w:rPr>
-                <w:rFonts w:ascii="Cambria Math" w:hAnsi="Cambria Math"/>
-                <w:i/>
-              </w:rPr>
-            </m:ctrlPr>
-          </m:dPr>
-          <m:e>
-            <m:r>
-              <w:rPr>
-                <w:rFonts w:ascii="Cambria Math" w:hAnsi="Cambria Math"/>
-              </w:rPr>
-              <m:t>t</m:t>
-            </m:r>
-          </m:e>
-        </m:d>
-        <m:r>
-          <w:rPr>
-            <w:rFonts w:ascii="Cambria Math" w:hAnsi="Cambria Math"/>
-          </w:rPr>
-          <m:t xml:space="preserve"> = 0;</m:t>
-        </m:r>
-      </m:oMath>
-      <w:r>
-        <w:t xml:space="preserve"> the second derivative test classifies them as maxima or minima</w:t>
+        <w:t>The critical points are given by the equation D^’(t) = 0, and the second derivative determines the nature of the critical points as a maximum and minimum.</w:t>
       </w:r>
     </w:p>
     <w:p>
@@ -2703,68 +2506,18 @@
         <w:spacing w:after="40"/>
       </w:pPr>
       <w:r>
-        <w:t xml:space="preserve">Inflection points occur where </w:t>
+        <w:t>Inflection poin</w:t>
       </w:r>
-      <m:oMath>
-        <m:sSup>
-          <m:sSupPr>
-            <m:ctrlPr>
-              <w:rPr>
-                <w:rFonts w:ascii="Cambria Math" w:hAnsi="Cambria Math"/>
-                <w:i/>
-              </w:rPr>
-            </m:ctrlPr>
-          </m:sSupPr>
-          <m:e>
-            <m:r>
-              <w:rPr>
-                <w:rFonts w:ascii="Cambria Math" w:hAnsi="Cambria Math"/>
-              </w:rPr>
-              <m:t>D</m:t>
-            </m:r>
-          </m:e>
-          <m:sup>
-            <m:r>
-              <w:rPr>
-                <w:rFonts w:ascii="Cambria Math" w:hAnsi="Cambria Math"/>
-              </w:rPr>
-              <m:t>'</m:t>
-            </m:r>
-            <m:r>
-              <w:rPr>
-                <w:rFonts w:ascii="Cambria Math" w:hAnsi="Cambria Math"/>
-              </w:rPr>
-              <m:t>'</m:t>
-            </m:r>
-          </m:sup>
-        </m:sSup>
-        <m:d>
-          <m:dPr>
-            <m:ctrlPr>
-              <w:rPr>
-                <w:rFonts w:ascii="Cambria Math" w:hAnsi="Cambria Math"/>
-                <w:i/>
-              </w:rPr>
-            </m:ctrlPr>
-          </m:dPr>
-          <m:e>
-            <m:r>
-              <w:rPr>
-                <w:rFonts w:ascii="Cambria Math" w:hAnsi="Cambria Math"/>
-              </w:rPr>
-              <m:t>t</m:t>
-            </m:r>
-          </m:e>
-        </m:d>
-        <m:r>
-          <w:rPr>
-            <w:rFonts w:ascii="Cambria Math" w:hAnsi="Cambria Math"/>
-          </w:rPr>
-          <m:t xml:space="preserve"> = 0</m:t>
-        </m:r>
-      </m:oMath>
       <w:r>
-        <w:t>, marking a change in concavity</w:t>
+        <w:t>ts are where D</w:t>
+      </w:r>
+      <w:proofErr w:type="gramStart"/>
+      <w:r>
+        <w:t>^’’</w:t>
+      </w:r>
+      <w:proofErr w:type="gramEnd"/>
+      <w:r>
+        <w:t>(t) = 0, where concavity changes.</w:t>
       </w:r>
     </w:p>
     <w:p>
@@ -2785,7 +2538,13 @@
         <w:rPr>
           <w:b/>
         </w:rPr>
-        <w:t>Step 1: Find critical points</w:t>
+        <w:t xml:space="preserve">Step 1: </w:t>
+      </w:r>
+      <w:r>
+        <w:rPr>
+          <w:b/>
+        </w:rPr>
+        <w:t>Identify the critical points of a function. To locate critical points of a function.</w:t>
       </w:r>
     </w:p>
     <w:p>
@@ -2869,21 +2628,7 @@
               <w:rFonts w:ascii="Cambria Math" w:hAnsi="Cambria Math"/>
               <w:sz w:val="24"/>
             </w:rPr>
-            <m:t>Divide by 12:</m:t>
-          </m:r>
-          <m:r>
-            <w:rPr>
-              <w:rFonts w:ascii="Cambria Math" w:hAnsi="Cambria Math"/>
-              <w:sz w:val="24"/>
-            </w:rPr>
-            <m:t xml:space="preserve"> </m:t>
-          </m:r>
-          <m:r>
-            <w:rPr>
-              <w:rFonts w:ascii="Cambria Math" w:hAnsi="Cambria Math"/>
-              <w:sz w:val="24"/>
-            </w:rPr>
-            <m:t xml:space="preserve"> </m:t>
+            <m:t xml:space="preserve">Divide by 12:  </m:t>
           </m:r>
           <m:sSup>
             <m:sSupPr>
@@ -2997,7 +2742,13 @@
         <w:rPr>
           <w:b/>
         </w:rPr>
-        <w:t>Step 2: Classify using the second derivative test</w:t>
+        <w:t xml:space="preserve">Step 2: </w:t>
+      </w:r>
+      <w:r>
+        <w:rPr>
+          <w:b/>
+        </w:rPr>
+        <w:t>Use the second derivative test to classify</w:t>
       </w:r>
     </w:p>
     <w:p>
@@ -3036,14 +2787,7 @@
                   <w:rFonts w:ascii="Cambria Math" w:hAnsi="Cambria Math"/>
                   <w:sz w:val="24"/>
                 </w:rPr>
-                <m:t>'</m:t>
-              </m:r>
-              <m:r>
-                <w:rPr>
-                  <w:rFonts w:ascii="Cambria Math" w:hAnsi="Cambria Math"/>
-                  <w:sz w:val="24"/>
-                </w:rPr>
-                <m:t>'</m:t>
+                <m:t>''</m:t>
               </m:r>
             </m:sup>
           </m:sSup>
@@ -3113,14 +2857,7 @@
                   <w:rFonts w:ascii="Cambria Math" w:hAnsi="Cambria Math"/>
                   <w:sz w:val="24"/>
                 </w:rPr>
-                <m:t>'</m:t>
-              </m:r>
-              <m:r>
-                <w:rPr>
-                  <w:rFonts w:ascii="Cambria Math" w:hAnsi="Cambria Math"/>
-                  <w:sz w:val="24"/>
-                </w:rPr>
-                <m:t>'</m:t>
+                <m:t>''</m:t>
               </m:r>
             </m:sup>
           </m:sSup>
@@ -3171,7 +2908,13 @@
         <w:rPr>
           <w:b/>
         </w:rPr>
-        <w:t>Step 3: Find the inflection point</w:t>
+        <w:t>Step 3:</w:t>
+      </w:r>
+      <w:r>
+        <w:rPr>
+          <w:b/>
+        </w:rPr>
+        <w:t xml:space="preserve"> Sketch a graph of a function</w:t>
       </w:r>
     </w:p>
     <w:p>
@@ -3217,14 +2960,7 @@
                   <w:rFonts w:ascii="Cambria Math" w:hAnsi="Cambria Math"/>
                   <w:sz w:val="24"/>
                 </w:rPr>
-                <m:t>'</m:t>
-              </m:r>
-              <m:r>
-                <w:rPr>
-                  <w:rFonts w:ascii="Cambria Math" w:hAnsi="Cambria Math"/>
-                  <w:sz w:val="24"/>
-                </w:rPr>
-                <m:t>'</m:t>
+                <m:t>''</m:t>
               </m:r>
             </m:sup>
           </m:sSup>
@@ -3330,8 +3066,22 @@
         <w:rPr>
           <w:b/>
         </w:rPr>
-        <w:t>Step 4: Determine intervals of increase and decrease</w:t>
+        <w:t xml:space="preserve">Step 4: </w:t>
       </w:r>
+      <w:r>
+        <w:rPr>
+          <w:b/>
+        </w:rPr>
+        <w:t xml:space="preserve">Determine intervals of increase and </w:t>
+      </w:r>
+      <w:proofErr w:type="spellStart"/>
+      <w:r>
+        <w:rPr>
+          <w:b/>
+        </w:rPr>
+        <w:t>descrease</w:t>
+      </w:r>
+      <w:proofErr w:type="spellEnd"/>
     </w:p>
     <w:p>
       <w:pPr>
@@ -3409,8 +3159,13 @@
         <w:spacing w:after="120"/>
       </w:pPr>
       <w:r>
-        <w:t>SymPy was used to symbolically compute derivatives and solve for critical points:</w:t>
+        <w:t xml:space="preserve">The symbolic computation of derivatives and the solving of critical points was done using </w:t>
       </w:r>
+      <w:proofErr w:type="spellStart"/>
+      <w:r>
+        <w:t>SymPy</w:t>
+      </w:r>
+      <w:proofErr w:type="spellEnd"/>
     </w:p>
     <w:p>
       <w:pPr>
@@ -3430,7 +3185,32 @@
         <w:spacing w:after="40"/>
       </w:pPr>
       <w:r>
-        <w:t>Critical points from sympy: [1, 2] (matches hand calculation)</w:t>
+        <w:t>Critical points fo</w:t>
+      </w:r>
+      <w:r>
+        <w:t>r</w:t>
+      </w:r>
+      <w:r>
+        <w:t xml:space="preserve"> </w:t>
+      </w:r>
+      <w:proofErr w:type="spellStart"/>
+      <w:r>
+        <w:t>sympy</w:t>
+      </w:r>
+      <w:proofErr w:type="spellEnd"/>
+      <w:r>
+        <w:t>: [1, 2] (</w:t>
+      </w:r>
+      <w:r>
+        <w:t xml:space="preserve">as expected from hand </w:t>
+      </w:r>
+      <w:proofErr w:type="spellStart"/>
+      <w:r>
+        <w:t>calculaion</w:t>
+      </w:r>
+      <w:proofErr w:type="spellEnd"/>
+      <w:r>
+        <w:t>)</w:t>
       </w:r>
     </w:p>
     <w:p>
@@ -3439,7 +3219,29 @@
         <w:spacing w:after="40"/>
       </w:pPr>
       <w:r>
-        <w:t>Inflection point from sympy: [3/2] = 1.5 (matches hand calculation)</w:t>
+        <w:t xml:space="preserve">Inflection </w:t>
+      </w:r>
+      <w:proofErr w:type="gramStart"/>
+      <w:r>
+        <w:t>point</w:t>
+      </w:r>
+      <w:proofErr w:type="gramEnd"/>
+      <w:r>
+        <w:t xml:space="preserve"> </w:t>
+      </w:r>
+      <w:r>
+        <w:t>o</w:t>
+      </w:r>
+      <w:r>
+        <w:t xml:space="preserve">f </w:t>
+      </w:r>
+      <w:proofErr w:type="spellStart"/>
+      <w:r>
+        <w:t>sympy</w:t>
+      </w:r>
+      <w:proofErr w:type="spellEnd"/>
+      <w:r>
+        <w:t>: [3/2] = 1.5 (matches hand calculation)</w:t>
       </w:r>
     </w:p>
     <w:p>
@@ -3457,7 +3259,16 @@
         <w:spacing w:after="120"/>
       </w:pPr>
       <w:r>
-        <w:t>The analysis reveals a clear demand pattern over the 4-hour window. Demand starts at 90 units and rises to a morning peak of 100 units at t = 1 hour. It then declines to a trough of 98 units at t = 2 hours, before rising again - reaching 108 units by t = 3 hours and 154 units by t = 4 hours.</w:t>
+        <w:t xml:space="preserve">The analysis shows that there is definite demand pattern existing in the 4-hour window. Demand is 90 at </w:t>
+      </w:r>
+      <w:r>
+        <w:t>the</w:t>
+      </w:r>
+      <w:r>
+        <w:t xml:space="preserve"> beginning and increases to a peak</w:t>
+      </w:r>
+      <w:r>
+        <w:t xml:space="preserve"> in the morning, 100 units at t = 1 hour. It then falls to 98 units at t = 3 hours and 154 units at t = 4 hours.</w:t>
       </w:r>
     </w:p>
     <w:p>
@@ -3465,7 +3276,15 @@
         <w:spacing w:after="120"/>
       </w:pPr>
       <w:r>
-        <w:t>The inflection point at t = 1.5 hours is particularly interesting: this is where the rate of decrease itself begins to slow down, signalling that the system is preparing to recover even before demand actually starts rising at t = 2 hours. This early-warning signal could be valuable for automated resource management systems.</w:t>
+        <w:t xml:space="preserve">Of particular interest is the inflection point at t = 1.5 hours – the rate of decrease is themselves decreasing, thereby indicating that the system will begin to recover even prior to the beginning of the demand increase at t = 2 hours. This early warning mechanism is useful to automated resource management </w:t>
+      </w:r>
+      <w:proofErr w:type="gramStart"/>
+      <w:r>
+        <w:t>system</w:t>
+      </w:r>
+      <w:proofErr w:type="gramEnd"/>
+      <w:r>
+        <w:t>.</w:t>
       </w:r>
     </w:p>
     <w:p>
@@ -3473,7 +3292,7 @@
         <w:spacing w:after="120"/>
       </w:pPr>
       <w:r>
-        <w:t>For operational planning: the period between t = 1 and t = 2 hours (the dip) is the ideal window for scheduled maintenance or resource reallocation, since demand is at its lowest and the system is under least stress. The morning peak at t = 1 requires pre-positioned capacity, and the post-t = 2 growth phase requires plans for sustained increase.</w:t>
+        <w:t>For Operational Planning period t = 1 – 2 hours (dip) is the best for scheduled maintenance or reallocation of resources as demand is at a minimum and the system is under the least stress. Pre-positioned capacity is needed for the morning peak at t = 1 – and plans for continued growth must be in place for the growth phase after t = 2.</w:t>
       </w:r>
     </w:p>
     <w:p>
@@ -3482,9 +3301,14 @@
       </w:pPr>
       <w:bookmarkStart w:id="12" w:name="_Toc234248672"/>
       <w:r>
-        <w:t>4.4 Visualisation</w:t>
+        <w:t xml:space="preserve">4.4 </w:t>
+      </w:r>
+      <w:proofErr w:type="spellStart"/>
+      <w:r>
+        <w:t>Visualisation</w:t>
       </w:r>
       <w:bookmarkEnd w:id="12"/>
+      <w:proofErr w:type="spellEnd"/>
     </w:p>
     <w:p>
       <w:pPr>
@@ -3542,18 +3366,32 @@
           <w:sz w:val="18"/>
         </w:rPr>
         <w:lastRenderedPageBreak/>
-        <w:t>Figure 2: Demand over time D(t) (top) with critical points marked, and the rate of change D'(t) (bottom) with increasing/decreasing regions shaded.</w:t>
+        <w:t xml:space="preserve">The rate of change D’(t) (bottom) and the demand </w:t>
+      </w:r>
+      <w:proofErr w:type="gramStart"/>
+      <w:r>
+        <w:rPr>
+          <w:i/>
+          <w:sz w:val="18"/>
+        </w:rPr>
+        <w:t>over time</w:t>
+      </w:r>
+      <w:proofErr w:type="gramEnd"/>
+      <w:r>
+        <w:rPr>
+          <w:i/>
+          <w:sz w:val="18"/>
+        </w:rPr>
+        <w:t xml:space="preserve"> D(t) (top) with the critical points highlighted.</w:t>
       </w:r>
     </w:p>
     <w:p>
-      <w:pPr>
-        <w:spacing w:after="120"/>
-      </w:pPr>
       <w:r>
-        <w:t>Figure 2 presents two related plots. The top panel shows the demand curve D(t) with the local maximum (red), local minimum (orange), and inflection point (dotted line) clearly marked. The bottom panel shows D'(t) - the rate of change - with green shading where demand is increasing and red shading where it is decreasing. The zero-crossings of D'(t) at t = 1 and t = 2 correspond exactly to the critical points on the demand curve.</w:t>
+        <w:t>Two related plots are shown in figure 2. The graph on top displays the demand curve D(t) with the inflection point (red dotted line), the local minimum (red line), and the local maximum</w:t>
       </w:r>
-    </w:p>
-    <w:p>
+      <w:r>
+        <w:t xml:space="preserve"> (the orange line) highlighted. The bottom panel is the rate of change D’(t), and the green shaded region is for increasing demand, while the red shaded region is for decreasing demand. The critical points of the demand curve are the zeros of D’(t) at t = 1 and t = 2.</w:t>
+      </w:r>
       <w:r>
         <w:br w:type="page"/>
       </w:r>
@@ -3574,7 +3412,23 @@
         <w:spacing w:after="120"/>
       </w:pPr>
       <w:r>
-        <w:t>Anton, H., Rorres, C. and Kaul, A. (2014) Elementary Linear Algebra: Applications Version. 11th edn. Hoboken: Wiley.</w:t>
+        <w:t xml:space="preserve">Anton, H., </w:t>
+      </w:r>
+      <w:proofErr w:type="spellStart"/>
+      <w:r>
+        <w:t>Rorres</w:t>
+      </w:r>
+      <w:proofErr w:type="spellEnd"/>
+      <w:r>
+        <w:t xml:space="preserve">, C. and Kaul, A. (2014) Elementary Linear Algebra: Applications Version. 11th </w:t>
+      </w:r>
+      <w:proofErr w:type="spellStart"/>
+      <w:r>
+        <w:t>edn</w:t>
+      </w:r>
+      <w:proofErr w:type="spellEnd"/>
+      <w:r>
+        <w:t>. Hoboken: Wiley.</w:t>
       </w:r>
     </w:p>
     <w:p>
@@ -3582,7 +3436,15 @@
         <w:spacing w:after="120"/>
       </w:pPr>
       <w:r>
-        <w:t>Stewart, J. (2016) Calculus: Early Transcendentals. 8th edn. Boston: Cengage Learning.</w:t>
+        <w:t xml:space="preserve">Stewart, J. (2016) Calculus: Early Transcendentals. 8th </w:t>
+      </w:r>
+      <w:proofErr w:type="spellStart"/>
+      <w:r>
+        <w:t>edn</w:t>
+      </w:r>
+      <w:proofErr w:type="spellEnd"/>
+      <w:r>
+        <w:t>. Boston: Cengage Learning.</w:t>
       </w:r>
     </w:p>
     <w:p>
@@ -3590,7 +3452,15 @@
         <w:spacing w:after="120"/>
       </w:pPr>
       <w:r>
-        <w:t>Thomas, G.B., Weir, M.D. and Hass, J. (2018) Thomas' Calculus. 14th edn. Boston: Pearson.</w:t>
+        <w:t xml:space="preserve">Thomas, G.B., Weir, M.D. and Hass, J. (2018) Thomas' Calculus. 14th </w:t>
+      </w:r>
+      <w:proofErr w:type="spellStart"/>
+      <w:r>
+        <w:t>edn</w:t>
+      </w:r>
+      <w:proofErr w:type="spellEnd"/>
+      <w:r>
+        <w:t>. Boston: Pearson.</w:t>
       </w:r>
     </w:p>
     <w:p>
@@ -3823,7 +3693,7 @@
   <w:abstractNum w:abstractNumId="8" w15:restartNumberingAfterBreak="0">
     <w:nsid w:val="FFFFFF89"/>
     <w:multiLevelType w:val="singleLevel"/>
-    <w:tmpl w:val="29761A62"/>
+    <w:tmpl w:val="C94E453C"/>
     <w:lvl w:ilvl="0">
       <w:start w:val="1"/>
       <w:numFmt w:val="bullet"/>
@@ -4566,7 +4436,6 @@
   <w:style w:type="character" w:default="1" w:styleId="DefaultParagraphFont">
     <w:name w:val="Default Paragraph Font"/>
     <w:uiPriority w:val="1"/>
-    <w:semiHidden/>
     <w:unhideWhenUsed/>
   </w:style>
   <w:style w:type="table" w:default="1" w:styleId="TableNormal">
@@ -13483,7 +13352,7 @@
       </w:tcPr>
     </w:tblStylePr>
   </w:style>
-  <w:style w:type="table" w:styleId="ColourfulShading">
+  <w:style w:type="table" w:styleId="ColorfulShading">
     <w:name w:val="Colorful Shading"/>
     <w:basedOn w:val="TableNormal"/>
     <w:uiPriority w:val="71"/>
@@ -13598,7 +13467,7 @@
       </w:rPr>
     </w:tblStylePr>
   </w:style>
-  <w:style w:type="table" w:styleId="ColourfulShadingAccent1">
+  <w:style w:type="table" w:styleId="ColorfulShading-Accent1">
     <w:name w:val="Colorful Shading Accent 1"/>
     <w:basedOn w:val="TableNormal"/>
     <w:uiPriority w:val="71"/>
@@ -13713,7 +13582,7 @@
       </w:rPr>
     </w:tblStylePr>
   </w:style>
-  <w:style w:type="table" w:styleId="ColourfulShadingAccent2">
+  <w:style w:type="table" w:styleId="ColorfulShading-Accent2">
     <w:name w:val="Colorful Shading Accent 2"/>
     <w:basedOn w:val="TableNormal"/>
     <w:uiPriority w:val="71"/>
@@ -13828,7 +13697,7 @@
       </w:rPr>
     </w:tblStylePr>
   </w:style>
-  <w:style w:type="table" w:styleId="ColourfulShadingAccent3">
+  <w:style w:type="table" w:styleId="ColorfulShading-Accent3">
     <w:name w:val="Colorful Shading Accent 3"/>
     <w:basedOn w:val="TableNormal"/>
     <w:uiPriority w:val="71"/>
@@ -13933,7 +13802,7 @@
       </w:tcPr>
     </w:tblStylePr>
   </w:style>
-  <w:style w:type="table" w:styleId="ColourfulShadingAccent4">
+  <w:style w:type="table" w:styleId="ColorfulShading-Accent4">
     <w:name w:val="Colorful Shading Accent 4"/>
     <w:basedOn w:val="TableNormal"/>
     <w:uiPriority w:val="71"/>
@@ -14048,7 +13917,7 @@
       </w:rPr>
     </w:tblStylePr>
   </w:style>
-  <w:style w:type="table" w:styleId="ColourfulShadingAccent5">
+  <w:style w:type="table" w:styleId="ColorfulShading-Accent5">
     <w:name w:val="Colorful Shading Accent 5"/>
     <w:basedOn w:val="TableNormal"/>
     <w:uiPriority w:val="71"/>
@@ -14163,7 +14032,7 @@
       </w:rPr>
     </w:tblStylePr>
   </w:style>
-  <w:style w:type="table" w:styleId="ColourfulShadingAccent6">
+  <w:style w:type="table" w:styleId="ColorfulShading-Accent6">
     <w:name w:val="Colorful Shading Accent 6"/>
     <w:basedOn w:val="TableNormal"/>
     <w:uiPriority w:val="71"/>
@@ -14278,7 +14147,7 @@
       </w:rPr>
     </w:tblStylePr>
   </w:style>
-  <w:style w:type="table" w:styleId="ColourfulList">
+  <w:style w:type="table" w:styleId="ColorfulList">
     <w:name w:val="Colorful List"/>
     <w:basedOn w:val="TableNormal"/>
     <w:uiPriority w:val="72"/>
@@ -14357,7 +14226,7 @@
       </w:tcPr>
     </w:tblStylePr>
   </w:style>
-  <w:style w:type="table" w:styleId="ColourfulListAccent1">
+  <w:style w:type="table" w:styleId="ColorfulList-Accent1">
     <w:name w:val="Colorful List Accent 1"/>
     <w:basedOn w:val="TableNormal"/>
     <w:uiPriority w:val="72"/>
@@ -14436,7 +14305,7 @@
       </w:tcPr>
     </w:tblStylePr>
   </w:style>
-  <w:style w:type="table" w:styleId="ColourfulListAccent2">
+  <w:style w:type="table" w:styleId="ColorfulList-Accent2">
     <w:name w:val="Colorful List Accent 2"/>
     <w:basedOn w:val="TableNormal"/>
     <w:uiPriority w:val="72"/>
@@ -14515,7 +14384,7 @@
       </w:tcPr>
     </w:tblStylePr>
   </w:style>
-  <w:style w:type="table" w:styleId="ColourfulListAccent3">
+  <w:style w:type="table" w:styleId="ColorfulList-Accent3">
     <w:name w:val="Colorful List Accent 3"/>
     <w:basedOn w:val="TableNormal"/>
     <w:uiPriority w:val="72"/>
@@ -14594,7 +14463,7 @@
       </w:tcPr>
     </w:tblStylePr>
   </w:style>
-  <w:style w:type="table" w:styleId="ColourfulListAccent4">
+  <w:style w:type="table" w:styleId="ColorfulList-Accent4">
     <w:name w:val="Colorful List Accent 4"/>
     <w:basedOn w:val="TableNormal"/>
     <w:uiPriority w:val="72"/>
@@ -14673,7 +14542,7 @@
       </w:tcPr>
     </w:tblStylePr>
   </w:style>
-  <w:style w:type="table" w:styleId="ColourfulListAccent5">
+  <w:style w:type="table" w:styleId="ColorfulList-Accent5">
     <w:name w:val="Colorful List Accent 5"/>
     <w:basedOn w:val="TableNormal"/>
     <w:uiPriority w:val="72"/>
@@ -14752,7 +14621,7 @@
       </w:tcPr>
     </w:tblStylePr>
   </w:style>
-  <w:style w:type="table" w:styleId="ColourfulListAccent6">
+  <w:style w:type="table" w:styleId="ColorfulList-Accent6">
     <w:name w:val="Colorful List Accent 6"/>
     <w:basedOn w:val="TableNormal"/>
     <w:uiPriority w:val="72"/>
@@ -14831,7 +14700,7 @@
       </w:tcPr>
     </w:tblStylePr>
   </w:style>
-  <w:style w:type="table" w:styleId="ColourfulGrid">
+  <w:style w:type="table" w:styleId="ColorfulGrid">
     <w:name w:val="Colorful Grid"/>
     <w:basedOn w:val="TableNormal"/>
     <w:uiPriority w:val="73"/>
@@ -14904,7 +14773,7 @@
       </w:tcPr>
     </w:tblStylePr>
   </w:style>
-  <w:style w:type="table" w:styleId="ColourfulGridAccent1">
+  <w:style w:type="table" w:styleId="ColorfulGrid-Accent1">
     <w:name w:val="Colorful Grid Accent 1"/>
     <w:basedOn w:val="TableNormal"/>
     <w:uiPriority w:val="73"/>
@@ -14977,7 +14846,7 @@
       </w:tcPr>
     </w:tblStylePr>
   </w:style>
-  <w:style w:type="table" w:styleId="ColourfulGridAccent2">
+  <w:style w:type="table" w:styleId="ColorfulGrid-Accent2">
     <w:name w:val="Colorful Grid Accent 2"/>
     <w:basedOn w:val="TableNormal"/>
     <w:uiPriority w:val="73"/>
@@ -15050,7 +14919,7 @@
       </w:tcPr>
     </w:tblStylePr>
   </w:style>
-  <w:style w:type="table" w:styleId="ColourfulGridAccent3">
+  <w:style w:type="table" w:styleId="ColorfulGrid-Accent3">
     <w:name w:val="Colorful Grid Accent 3"/>
     <w:basedOn w:val="TableNormal"/>
     <w:uiPriority w:val="73"/>
@@ -15123,7 +14992,7 @@
       </w:tcPr>
     </w:tblStylePr>
   </w:style>
-  <w:style w:type="table" w:styleId="ColourfulGridAccent4">
+  <w:style w:type="table" w:styleId="ColorfulGrid-Accent4">
     <w:name w:val="Colorful Grid Accent 4"/>
     <w:basedOn w:val="TableNormal"/>
     <w:uiPriority w:val="73"/>
@@ -15196,7 +15065,7 @@
       </w:tcPr>
     </w:tblStylePr>
   </w:style>
-  <w:style w:type="table" w:styleId="ColourfulGridAccent5">
+  <w:style w:type="table" w:styleId="ColorfulGrid-Accent5">
     <w:name w:val="Colorful Grid Accent 5"/>
     <w:basedOn w:val="TableNormal"/>
     <w:uiPriority w:val="73"/>
@@ -15269,7 +15138,7 @@
       </w:tcPr>
     </w:tblStylePr>
   </w:style>
-  <w:style w:type="table" w:styleId="ColourfulGridAccent6">
+  <w:style w:type="table" w:styleId="ColorfulGrid-Accent6">
     <w:name w:val="Colorful Grid Accent 6"/>
     <w:basedOn w:val="TableNormal"/>
     <w:uiPriority w:val="73"/>

</xml_diff>